<commit_message>
support two names and add template
</commit_message>
<xml_diff>
--- a/templates/template.docx
+++ b/templates/template.docx
@@ -425,16 +425,22 @@
               <w:right w:val="single" w:sz="4" w:space="0" w:color="auto"/>
             </w:tcBorders>
           </w:tcPr>
-          <w:p>
-            <w:pPr>
-              <w:rPr>
-                <w:rFonts w:ascii="Arial" w:hAnsi="Arial" w:cs="Arial"/>
-                <w:b/>
-                <w:bCs/>
-                <w:sz w:val="24"/>
-                <w:szCs w:val="24"/>
-              </w:rPr>
-            </w:pPr>
+          <w:p xmlns:w="http://schemas.openxmlformats.org/wordprocessingml/2006/main">
+            <w:pPr>
+              <w:rPr>
+                <w:rFonts w:ascii="Arial" w:hAnsi="Arial" w:cs="Arial"/>
+                <w:sz w:val="24"/>
+                <w:szCs w:val="24"/>
+              </w:rPr>
+            </w:pPr>
+            <w:r>
+              <w:rPr>
+                <w:rFonts w:ascii="Arial" w:hAnsi="Arial" w:cs="Arial"/>
+                <w:sz w:val="24"/>
+                <w:szCs w:val="24"/>
+              </w:rPr>
+              <w:t xml:space="preserve">{life2_name}</w:t>
+            </w:r>
           </w:p>
         </w:tc>
       </w:tr>
@@ -522,16 +528,22 @@
           <w:tcPr>
             <w:tcW w:w="3604" w:type="dxa"/>
           </w:tcPr>
-          <w:p>
-            <w:pPr>
-              <w:rPr>
-                <w:rFonts w:ascii="Arial" w:hAnsi="Arial" w:cs="Arial"/>
-                <w:b/>
-                <w:bCs/>
-                <w:sz w:val="24"/>
-                <w:szCs w:val="24"/>
-              </w:rPr>
-            </w:pPr>
+          <w:p xmlns:w="http://schemas.openxmlformats.org/wordprocessingml/2006/main">
+            <w:pPr>
+              <w:rPr>
+                <w:rFonts w:ascii="Arial" w:hAnsi="Arial" w:cs="Arial"/>
+                <w:sz w:val="24"/>
+                <w:szCs w:val="24"/>
+              </w:rPr>
+            </w:pPr>
+            <w:r>
+              <w:rPr>
+                <w:rFonts w:ascii="Arial" w:hAnsi="Arial" w:cs="Arial"/>
+                <w:sz w:val="24"/>
+                <w:szCs w:val="24"/>
+              </w:rPr>
+              <w:t xml:space="preserve">{life2_dob}</w:t>
+            </w:r>
           </w:p>
         </w:tc>
       </w:tr>
@@ -619,16 +631,22 @@
           <w:tcPr>
             <w:tcW w:w="3604" w:type="dxa"/>
           </w:tcPr>
-          <w:p>
-            <w:pPr>
-              <w:rPr>
-                <w:rFonts w:ascii="Arial" w:hAnsi="Arial" w:cs="Arial"/>
-                <w:b/>
-                <w:bCs/>
-                <w:sz w:val="24"/>
-                <w:szCs w:val="24"/>
-              </w:rPr>
-            </w:pPr>
+          <w:p xmlns:w="http://schemas.openxmlformats.org/wordprocessingml/2006/main">
+            <w:pPr>
+              <w:rPr>
+                <w:rFonts w:ascii="Arial" w:hAnsi="Arial" w:cs="Arial"/>
+                <w:sz w:val="24"/>
+                <w:szCs w:val="24"/>
+              </w:rPr>
+            </w:pPr>
+            <w:r>
+              <w:rPr>
+                <w:rFonts w:ascii="Arial" w:hAnsi="Arial" w:cs="Arial"/>
+                <w:sz w:val="24"/>
+                <w:szCs w:val="24"/>
+              </w:rPr>
+              <w:t xml:space="preserve">{life2_occupation}</w:t>
+            </w:r>
           </w:p>
         </w:tc>
       </w:tr>
@@ -716,16 +734,22 @@
           <w:tcPr>
             <w:tcW w:w="3604" w:type="dxa"/>
           </w:tcPr>
-          <w:p>
-            <w:pPr>
-              <w:rPr>
-                <w:rFonts w:ascii="Arial" w:hAnsi="Arial" w:cs="Arial"/>
-                <w:b/>
-                <w:bCs/>
-                <w:sz w:val="24"/>
-                <w:szCs w:val="24"/>
-              </w:rPr>
-            </w:pPr>
+          <w:p xmlns:w="http://schemas.openxmlformats.org/wordprocessingml/2006/main">
+            <w:pPr>
+              <w:rPr>
+                <w:rFonts w:ascii="Arial" w:hAnsi="Arial" w:cs="Arial"/>
+                <w:sz w:val="24"/>
+                <w:szCs w:val="24"/>
+              </w:rPr>
+            </w:pPr>
+            <w:r>
+              <w:rPr>
+                <w:rFonts w:ascii="Arial" w:hAnsi="Arial" w:cs="Arial"/>
+                <w:sz w:val="24"/>
+                <w:szCs w:val="24"/>
+              </w:rPr>
+              <w:t xml:space="preserve">{life2_address}</w:t>
+            </w:r>
           </w:p>
         </w:tc>
       </w:tr>
@@ -813,16 +837,22 @@
           <w:tcPr>
             <w:tcW w:w="3604" w:type="dxa"/>
           </w:tcPr>
-          <w:p>
-            <w:pPr>
-              <w:rPr>
-                <w:rFonts w:ascii="Arial" w:hAnsi="Arial" w:cs="Arial"/>
-                <w:b/>
-                <w:bCs/>
-                <w:sz w:val="24"/>
-                <w:szCs w:val="24"/>
-              </w:rPr>
-            </w:pPr>
+          <w:p xmlns:w="http://schemas.openxmlformats.org/wordprocessingml/2006/main">
+            <w:pPr>
+              <w:rPr>
+                <w:rFonts w:ascii="Arial" w:hAnsi="Arial" w:cs="Arial"/>
+                <w:sz w:val="24"/>
+                <w:szCs w:val="24"/>
+              </w:rPr>
+            </w:pPr>
+            <w:r>
+              <w:rPr>
+                <w:rFonts w:ascii="Arial" w:hAnsi="Arial" w:cs="Arial"/>
+                <w:sz w:val="24"/>
+                <w:szCs w:val="24"/>
+              </w:rPr>
+              <w:t xml:space="preserve">{life2_mobile}</w:t>
+            </w:r>
           </w:p>
         </w:tc>
       </w:tr>
@@ -910,16 +940,22 @@
           <w:tcPr>
             <w:tcW w:w="3604" w:type="dxa"/>
           </w:tcPr>
-          <w:p>
-            <w:pPr>
-              <w:rPr>
-                <w:rFonts w:ascii="Arial" w:hAnsi="Arial" w:cs="Arial"/>
-                <w:b/>
-                <w:bCs/>
-                <w:sz w:val="24"/>
-                <w:szCs w:val="24"/>
-              </w:rPr>
-            </w:pPr>
+          <w:p xmlns:w="http://schemas.openxmlformats.org/wordprocessingml/2006/main">
+            <w:pPr>
+              <w:rPr>
+                <w:rFonts w:ascii="Arial" w:hAnsi="Arial" w:cs="Arial"/>
+                <w:sz w:val="24"/>
+                <w:szCs w:val="24"/>
+              </w:rPr>
+            </w:pPr>
+            <w:r>
+              <w:rPr>
+                <w:rFonts w:ascii="Arial" w:hAnsi="Arial" w:cs="Arial"/>
+                <w:sz w:val="24"/>
+                <w:szCs w:val="24"/>
+              </w:rPr>
+              <w:t xml:space="preserve">{life2_email}</w:t>
+            </w:r>
           </w:p>
         </w:tc>
       </w:tr>
@@ -1098,16 +1134,22 @@
           <w:tcPr>
             <w:tcW w:w="3604" w:type="dxa"/>
           </w:tcPr>
-          <w:p>
-            <w:pPr>
-              <w:rPr>
-                <w:rFonts w:ascii="Arial" w:hAnsi="Arial" w:cs="Arial"/>
-                <w:b/>
-                <w:bCs/>
-                <w:sz w:val="24"/>
-                <w:szCs w:val="24"/>
-              </w:rPr>
-            </w:pPr>
+          <w:p xmlns:w="http://schemas.openxmlformats.org/wordprocessingml/2006/main">
+            <w:pPr>
+              <w:rPr>
+                <w:rFonts w:ascii="Arial" w:hAnsi="Arial" w:cs="Arial"/>
+                <w:sz w:val="24"/>
+                <w:szCs w:val="24"/>
+              </w:rPr>
+            </w:pPr>
+            <w:r>
+              <w:rPr>
+                <w:rFonts w:ascii="Arial" w:hAnsi="Arial" w:cs="Arial"/>
+                <w:sz w:val="24"/>
+                <w:szCs w:val="24"/>
+              </w:rPr>
+              <w:t xml:space="preserve">{life2_smoking_status}</w:t>
+            </w:r>
           </w:p>
         </w:tc>
       </w:tr>
@@ -1230,32 +1272,44 @@
           <w:tcPr>
             <w:tcW w:w="7221" w:type="dxa"/>
           </w:tcPr>
-          <w:p>
-            <w:pPr>
-              <w:rPr>
-                <w:rFonts w:ascii="Arial" w:hAnsi="Arial" w:cs="Arial"/>
-                <w:b/>
-                <w:bCs/>
-                <w:sz w:val="28"/>
-                <w:szCs w:val="28"/>
-              </w:rPr>
-            </w:pPr>
+          <w:p xmlns:w="http://schemas.openxmlformats.org/wordprocessingml/2006/main">
+            <w:pPr>
+              <w:rPr>
+                <w:rFonts w:ascii="Arial" w:hAnsi="Arial" w:cs="Arial"/>
+                <w:sz w:val="24"/>
+                <w:szCs w:val="24"/>
+              </w:rPr>
+            </w:pPr>
+            <w:r>
+              <w:rPr>
+                <w:rFonts w:ascii="Arial" w:hAnsi="Arial" w:cs="Arial"/>
+                <w:sz w:val="24"/>
+                <w:szCs w:val="24"/>
+              </w:rPr>
+              <w:t xml:space="preserve">{dep1_name}</w:t>
+            </w:r>
           </w:p>
         </w:tc>
         <w:tc>
           <w:tcPr>
             <w:tcW w:w="7221" w:type="dxa"/>
           </w:tcPr>
-          <w:p>
-            <w:pPr>
-              <w:rPr>
-                <w:rFonts w:ascii="Arial" w:hAnsi="Arial" w:cs="Arial"/>
-                <w:b/>
-                <w:bCs/>
-                <w:sz w:val="28"/>
-                <w:szCs w:val="28"/>
-              </w:rPr>
-            </w:pPr>
+          <w:p xmlns:w="http://schemas.openxmlformats.org/wordprocessingml/2006/main">
+            <w:pPr>
+              <w:rPr>
+                <w:rFonts w:ascii="Arial" w:hAnsi="Arial" w:cs="Arial"/>
+                <w:sz w:val="24"/>
+                <w:szCs w:val="24"/>
+              </w:rPr>
+            </w:pPr>
+            <w:r>
+              <w:rPr>
+                <w:rFonts w:ascii="Arial" w:hAnsi="Arial" w:cs="Arial"/>
+                <w:sz w:val="24"/>
+                <w:szCs w:val="24"/>
+              </w:rPr>
+              <w:t xml:space="preserve">{dep1_dob}</w:t>
+            </w:r>
           </w:p>
         </w:tc>
       </w:tr>
@@ -1267,32 +1321,44 @@
           <w:tcPr>
             <w:tcW w:w="7221" w:type="dxa"/>
           </w:tcPr>
-          <w:p>
-            <w:pPr>
-              <w:rPr>
-                <w:rFonts w:ascii="Arial" w:hAnsi="Arial" w:cs="Arial"/>
-                <w:b/>
-                <w:bCs/>
-                <w:sz w:val="28"/>
-                <w:szCs w:val="28"/>
-              </w:rPr>
-            </w:pPr>
+          <w:p xmlns:w="http://schemas.openxmlformats.org/wordprocessingml/2006/main">
+            <w:pPr>
+              <w:rPr>
+                <w:rFonts w:ascii="Arial" w:hAnsi="Arial" w:cs="Arial"/>
+                <w:sz w:val="24"/>
+                <w:szCs w:val="24"/>
+              </w:rPr>
+            </w:pPr>
+            <w:r>
+              <w:rPr>
+                <w:rFonts w:ascii="Arial" w:hAnsi="Arial" w:cs="Arial"/>
+                <w:sz w:val="24"/>
+                <w:szCs w:val="24"/>
+              </w:rPr>
+              <w:t xml:space="preserve">{dep2_name}</w:t>
+            </w:r>
           </w:p>
         </w:tc>
         <w:tc>
           <w:tcPr>
             <w:tcW w:w="7221" w:type="dxa"/>
           </w:tcPr>
-          <w:p>
-            <w:pPr>
-              <w:rPr>
-                <w:rFonts w:ascii="Arial" w:hAnsi="Arial" w:cs="Arial"/>
-                <w:b/>
-                <w:bCs/>
-                <w:sz w:val="28"/>
-                <w:szCs w:val="28"/>
-              </w:rPr>
-            </w:pPr>
+          <w:p xmlns:w="http://schemas.openxmlformats.org/wordprocessingml/2006/main">
+            <w:pPr>
+              <w:rPr>
+                <w:rFonts w:ascii="Arial" w:hAnsi="Arial" w:cs="Arial"/>
+                <w:sz w:val="24"/>
+                <w:szCs w:val="24"/>
+              </w:rPr>
+            </w:pPr>
+            <w:r>
+              <w:rPr>
+                <w:rFonts w:ascii="Arial" w:hAnsi="Arial" w:cs="Arial"/>
+                <w:sz w:val="24"/>
+                <w:szCs w:val="24"/>
+              </w:rPr>
+              <w:t xml:space="preserve">{dep2_dob}</w:t>
+            </w:r>
           </w:p>
         </w:tc>
       </w:tr>
@@ -1304,32 +1370,44 @@
           <w:tcPr>
             <w:tcW w:w="7221" w:type="dxa"/>
           </w:tcPr>
-          <w:p>
-            <w:pPr>
-              <w:rPr>
-                <w:rFonts w:ascii="Arial" w:hAnsi="Arial" w:cs="Arial"/>
-                <w:b/>
-                <w:bCs/>
-                <w:sz w:val="28"/>
-                <w:szCs w:val="28"/>
-              </w:rPr>
-            </w:pPr>
+          <w:p xmlns:w="http://schemas.openxmlformats.org/wordprocessingml/2006/main">
+            <w:pPr>
+              <w:rPr>
+                <w:rFonts w:ascii="Arial" w:hAnsi="Arial" w:cs="Arial"/>
+                <w:sz w:val="24"/>
+                <w:szCs w:val="24"/>
+              </w:rPr>
+            </w:pPr>
+            <w:r>
+              <w:rPr>
+                <w:rFonts w:ascii="Arial" w:hAnsi="Arial" w:cs="Arial"/>
+                <w:sz w:val="24"/>
+                <w:szCs w:val="24"/>
+              </w:rPr>
+              <w:t xml:space="preserve">{dep3_name}</w:t>
+            </w:r>
           </w:p>
         </w:tc>
         <w:tc>
           <w:tcPr>
             <w:tcW w:w="7221" w:type="dxa"/>
           </w:tcPr>
-          <w:p>
-            <w:pPr>
-              <w:rPr>
-                <w:rFonts w:ascii="Arial" w:hAnsi="Arial" w:cs="Arial"/>
-                <w:b/>
-                <w:bCs/>
-                <w:sz w:val="28"/>
-                <w:szCs w:val="28"/>
-              </w:rPr>
-            </w:pPr>
+          <w:p xmlns:w="http://schemas.openxmlformats.org/wordprocessingml/2006/main">
+            <w:pPr>
+              <w:rPr>
+                <w:rFonts w:ascii="Arial" w:hAnsi="Arial" w:cs="Arial"/>
+                <w:sz w:val="24"/>
+                <w:szCs w:val="24"/>
+              </w:rPr>
+            </w:pPr>
+            <w:r>
+              <w:rPr>
+                <w:rFonts w:ascii="Arial" w:hAnsi="Arial" w:cs="Arial"/>
+                <w:sz w:val="24"/>
+                <w:szCs w:val="24"/>
+              </w:rPr>
+              <w:t xml:space="preserve">{dep3_dob}</w:t>
+            </w:r>
           </w:p>
         </w:tc>
       </w:tr>
@@ -1463,7 +1541,7 @@
                 <w:sz w:val="28"/>
                 <w:szCs w:val="28"/>
               </w:rPr>
-              <w:t>€</w:t>
+              <w:t>{gross_annual_salary}</w:t>
             </w:r>
           </w:p>
         </w:tc>
@@ -1517,7 +1595,7 @@
                 <w:sz w:val="28"/>
                 <w:szCs w:val="28"/>
               </w:rPr>
-              <w:t>€</w:t>
+              <w:t>{net_monthly_income}</w:t>
             </w:r>
           </w:p>
         </w:tc>
@@ -1571,7 +1649,7 @@
                 <w:sz w:val="28"/>
                 <w:szCs w:val="28"/>
               </w:rPr>
-              <w:t>€</w:t>
+              <w:t>{other_net_monthly_income}</w:t>
             </w:r>
           </w:p>
         </w:tc>
@@ -1625,7 +1703,7 @@
                 <w:sz w:val="28"/>
                 <w:szCs w:val="28"/>
               </w:rPr>
-              <w:t>€</w:t>
+              <w:t>{total_net_monthly_income}</w:t>
             </w:r>
           </w:p>
         </w:tc>
@@ -1719,7 +1797,7 @@
                 <w:b/>
                 <w:bCs/>
               </w:rPr>
-              <w:t>€</w:t>
+              <w:t>{outgoing_mortgage}</w:t>
             </w:r>
           </w:p>
         </w:tc>
@@ -1769,7 +1847,7 @@
                 <w:b/>
                 <w:bCs/>
               </w:rPr>
-              <w:t>€</w:t>
+              <w:t>{outgoing_other_loans}</w:t>
             </w:r>
           </w:p>
         </w:tc>
@@ -1819,7 +1897,7 @@
                 <w:b/>
                 <w:bCs/>
               </w:rPr>
-              <w:t>€</w:t>
+              <w:t>{outgoing_life_savings_pension}</w:t>
             </w:r>
           </w:p>
         </w:tc>
@@ -1869,7 +1947,7 @@
                 <w:b/>
                 <w:bCs/>
               </w:rPr>
-              <w:t>€</w:t>
+              <w:t>{outgoing_regular_expenses}</w:t>
             </w:r>
           </w:p>
         </w:tc>
@@ -1919,7 +1997,7 @@
                 <w:b/>
                 <w:bCs/>
               </w:rPr>
-              <w:t>€</w:t>
+              <w:t>{outgoing_motor_travel}</w:t>
             </w:r>
           </w:p>
         </w:tc>
@@ -1969,7 +2047,7 @@
                 <w:b/>
                 <w:bCs/>
               </w:rPr>
-              <w:t>€</w:t>
+              <w:t>{outgoing_other}</w:t>
             </w:r>
           </w:p>
         </w:tc>
@@ -2019,7 +2097,7 @@
                 <w:b/>
                 <w:bCs/>
               </w:rPr>
-              <w:t>€</w:t>
+              <w:t>{outgoing_total}</w:t>
             </w:r>
           </w:p>
         </w:tc>
@@ -2100,15 +2178,22 @@
           <w:tcPr>
             <w:tcW w:w="6974" w:type="dxa"/>
           </w:tcPr>
-          <w:p>
-            <w:pPr>
-              <w:rPr>
-                <w:b/>
-                <w:bCs/>
-                <w:sz w:val="24"/>
-                <w:szCs w:val="24"/>
-              </w:rPr>
-            </w:pPr>
+          <w:p xmlns:w="http://schemas.openxmlformats.org/wordprocessingml/2006/main">
+            <w:pPr>
+              <w:rPr>
+                <w:rFonts w:ascii="Arial" w:hAnsi="Arial" w:cs="Arial"/>
+                <w:sz w:val="24"/>
+                <w:szCs w:val="24"/>
+              </w:rPr>
+            </w:pPr>
+            <w:r>
+              <w:rPr>
+                <w:rFonts w:ascii="Arial" w:hAnsi="Arial" w:cs="Arial"/>
+                <w:sz w:val="24"/>
+                <w:szCs w:val="24"/>
+              </w:rPr>
+              <w:t xml:space="preserve">{asset_home}</w:t>
+            </w:r>
           </w:p>
         </w:tc>
       </w:tr>
@@ -2145,15 +2230,22 @@
           <w:tcPr>
             <w:tcW w:w="6974" w:type="dxa"/>
           </w:tcPr>
-          <w:p>
-            <w:pPr>
-              <w:rPr>
-                <w:b/>
-                <w:bCs/>
-                <w:sz w:val="24"/>
-                <w:szCs w:val="24"/>
-              </w:rPr>
-            </w:pPr>
+          <w:p xmlns:w="http://schemas.openxmlformats.org/wordprocessingml/2006/main">
+            <w:pPr>
+              <w:rPr>
+                <w:rFonts w:ascii="Arial" w:hAnsi="Arial" w:cs="Arial"/>
+                <w:sz w:val="24"/>
+                <w:szCs w:val="24"/>
+              </w:rPr>
+            </w:pPr>
+            <w:r>
+              <w:rPr>
+                <w:rFonts w:ascii="Arial" w:hAnsi="Arial" w:cs="Arial"/>
+                <w:sz w:val="24"/>
+                <w:szCs w:val="24"/>
+              </w:rPr>
+              <w:t xml:space="preserve">{asset_mortgage}</w:t>
+            </w:r>
           </w:p>
         </w:tc>
       </w:tr>
@@ -2199,15 +2291,22 @@
           <w:tcPr>
             <w:tcW w:w="6974" w:type="dxa"/>
           </w:tcPr>
-          <w:p>
-            <w:pPr>
-              <w:rPr>
-                <w:b/>
-                <w:bCs/>
-                <w:sz w:val="24"/>
-                <w:szCs w:val="24"/>
-              </w:rPr>
-            </w:pPr>
+          <w:p xmlns:w="http://schemas.openxmlformats.org/wordprocessingml/2006/main">
+            <w:pPr>
+              <w:rPr>
+                <w:rFonts w:ascii="Arial" w:hAnsi="Arial" w:cs="Arial"/>
+                <w:sz w:val="24"/>
+                <w:szCs w:val="24"/>
+              </w:rPr>
+            </w:pPr>
+            <w:r>
+              <w:rPr>
+                <w:rFonts w:ascii="Arial" w:hAnsi="Arial" w:cs="Arial"/>
+                <w:sz w:val="24"/>
+                <w:szCs w:val="24"/>
+              </w:rPr>
+              <w:t xml:space="preserve">{asset_deposits}</w:t>
+            </w:r>
           </w:p>
         </w:tc>
       </w:tr>
@@ -2244,15 +2343,22 @@
           <w:tcPr>
             <w:tcW w:w="6974" w:type="dxa"/>
           </w:tcPr>
-          <w:p>
-            <w:pPr>
-              <w:rPr>
-                <w:b/>
-                <w:bCs/>
-                <w:sz w:val="24"/>
-                <w:szCs w:val="24"/>
-              </w:rPr>
-            </w:pPr>
+          <w:p xmlns:w="http://schemas.openxmlformats.org/wordprocessingml/2006/main">
+            <w:pPr>
+              <w:rPr>
+                <w:rFonts w:ascii="Arial" w:hAnsi="Arial" w:cs="Arial"/>
+                <w:sz w:val="24"/>
+                <w:szCs w:val="24"/>
+              </w:rPr>
+            </w:pPr>
+            <w:r>
+              <w:rPr>
+                <w:rFonts w:ascii="Arial" w:hAnsi="Arial" w:cs="Arial"/>
+                <w:sz w:val="24"/>
+                <w:szCs w:val="24"/>
+              </w:rPr>
+              <w:t xml:space="preserve">{asset_other_loans}</w:t>
+            </w:r>
           </w:p>
         </w:tc>
       </w:tr>
@@ -2289,15 +2395,22 @@
           <w:tcPr>
             <w:tcW w:w="6974" w:type="dxa"/>
           </w:tcPr>
-          <w:p>
-            <w:pPr>
-              <w:rPr>
-                <w:b/>
-                <w:bCs/>
-                <w:sz w:val="24"/>
-                <w:szCs w:val="24"/>
-              </w:rPr>
-            </w:pPr>
+          <w:p xmlns:w="http://schemas.openxmlformats.org/wordprocessingml/2006/main">
+            <w:pPr>
+              <w:rPr>
+                <w:rFonts w:ascii="Arial" w:hAnsi="Arial" w:cs="Arial"/>
+                <w:sz w:val="24"/>
+                <w:szCs w:val="24"/>
+              </w:rPr>
+            </w:pPr>
+            <w:r>
+              <w:rPr>
+                <w:rFonts w:ascii="Arial" w:hAnsi="Arial" w:cs="Arial"/>
+                <w:sz w:val="24"/>
+                <w:szCs w:val="24"/>
+              </w:rPr>
+              <w:t xml:space="preserve">{asset_net}</w:t>
+            </w:r>
           </w:p>
         </w:tc>
       </w:tr>
@@ -2368,15 +2481,22 @@
           <w:tcPr>
             <w:tcW w:w="6974" w:type="dxa"/>
           </w:tcPr>
-          <w:p>
-            <w:pPr>
-              <w:rPr>
-                <w:b/>
-                <w:bCs/>
-                <w:sz w:val="24"/>
-                <w:szCs w:val="24"/>
-              </w:rPr>
-            </w:pPr>
+          <w:p xmlns:w="http://schemas.openxmlformats.org/wordprocessingml/2006/main">
+            <w:pPr>
+              <w:rPr>
+                <w:rFonts w:ascii="Arial" w:hAnsi="Arial" w:cs="Arial"/>
+                <w:sz w:val="24"/>
+                <w:szCs w:val="24"/>
+              </w:rPr>
+            </w:pPr>
+            <w:r>
+              <w:rPr>
+                <w:rFonts w:ascii="Arial" w:hAnsi="Arial" w:cs="Arial"/>
+                <w:sz w:val="24"/>
+                <w:szCs w:val="24"/>
+              </w:rPr>
+              <w:t xml:space="preserve">{cover_total_life}</w:t>
+            </w:r>
           </w:p>
         </w:tc>
       </w:tr>
@@ -2413,15 +2533,22 @@
           <w:tcPr>
             <w:tcW w:w="6974" w:type="dxa"/>
           </w:tcPr>
-          <w:p>
-            <w:pPr>
-              <w:rPr>
-                <w:b/>
-                <w:bCs/>
-                <w:sz w:val="24"/>
-                <w:szCs w:val="24"/>
-              </w:rPr>
-            </w:pPr>
+          <w:p xmlns:w="http://schemas.openxmlformats.org/wordprocessingml/2006/main">
+            <w:pPr>
+              <w:rPr>
+                <w:rFonts w:ascii="Arial" w:hAnsi="Arial" w:cs="Arial"/>
+                <w:sz w:val="24"/>
+                <w:szCs w:val="24"/>
+              </w:rPr>
+            </w:pPr>
+            <w:r>
+              <w:rPr>
+                <w:rFonts w:ascii="Arial" w:hAnsi="Arial" w:cs="Arial"/>
+                <w:sz w:val="24"/>
+                <w:szCs w:val="24"/>
+              </w:rPr>
+              <w:t xml:space="preserve">{cover_total_illness}</w:t>
+            </w:r>
           </w:p>
         </w:tc>
       </w:tr>
@@ -2458,15 +2585,22 @@
           <w:tcPr>
             <w:tcW w:w="6974" w:type="dxa"/>
           </w:tcPr>
-          <w:p>
-            <w:pPr>
-              <w:rPr>
-                <w:b/>
-                <w:bCs/>
-                <w:sz w:val="24"/>
-                <w:szCs w:val="24"/>
-              </w:rPr>
-            </w:pPr>
+          <w:p xmlns:w="http://schemas.openxmlformats.org/wordprocessingml/2006/main">
+            <w:pPr>
+              <w:rPr>
+                <w:rFonts w:ascii="Arial" w:hAnsi="Arial" w:cs="Arial"/>
+                <w:sz w:val="24"/>
+                <w:szCs w:val="24"/>
+              </w:rPr>
+            </w:pPr>
+            <w:r>
+              <w:rPr>
+                <w:rFonts w:ascii="Arial" w:hAnsi="Arial" w:cs="Arial"/>
+                <w:sz w:val="24"/>
+                <w:szCs w:val="24"/>
+              </w:rPr>
+              <w:t xml:space="preserve">{cover_total_phi}</w:t>
+            </w:r>
           </w:p>
         </w:tc>
       </w:tr>
@@ -2503,15 +2637,22 @@
           <w:tcPr>
             <w:tcW w:w="6974" w:type="dxa"/>
           </w:tcPr>
-          <w:p>
-            <w:pPr>
-              <w:rPr>
-                <w:b/>
-                <w:bCs/>
-                <w:sz w:val="24"/>
-                <w:szCs w:val="24"/>
-              </w:rPr>
-            </w:pPr>
+          <w:p xmlns:w="http://schemas.openxmlformats.org/wordprocessingml/2006/main">
+            <w:pPr>
+              <w:rPr>
+                <w:rFonts w:ascii="Arial" w:hAnsi="Arial" w:cs="Arial"/>
+                <w:sz w:val="24"/>
+                <w:szCs w:val="24"/>
+              </w:rPr>
+            </w:pPr>
+            <w:r>
+              <w:rPr>
+                <w:rFonts w:ascii="Arial" w:hAnsi="Arial" w:cs="Arial"/>
+                <w:sz w:val="24"/>
+                <w:szCs w:val="24"/>
+              </w:rPr>
+              <w:t xml:space="preserve">{cover_pension_value}</w:t>
+            </w:r>
           </w:p>
         </w:tc>
       </w:tr>
@@ -2548,15 +2689,22 @@
           <w:tcPr>
             <w:tcW w:w="6974" w:type="dxa"/>
           </w:tcPr>
-          <w:p>
-            <w:pPr>
-              <w:rPr>
-                <w:b/>
-                <w:bCs/>
-                <w:sz w:val="24"/>
-                <w:szCs w:val="24"/>
-              </w:rPr>
-            </w:pPr>
+          <w:p xmlns:w="http://schemas.openxmlformats.org/wordprocessingml/2006/main">
+            <w:pPr>
+              <w:rPr>
+                <w:rFonts w:ascii="Arial" w:hAnsi="Arial" w:cs="Arial"/>
+                <w:sz w:val="24"/>
+                <w:szCs w:val="24"/>
+              </w:rPr>
+            </w:pPr>
+            <w:r>
+              <w:rPr>
+                <w:rFonts w:ascii="Arial" w:hAnsi="Arial" w:cs="Arial"/>
+                <w:sz w:val="24"/>
+                <w:szCs w:val="24"/>
+              </w:rPr>
+              <w:t xml:space="preserve">{cover_pension_contribution}</w:t>
+            </w:r>
           </w:p>
         </w:tc>
       </w:tr>
@@ -2593,15 +2741,22 @@
           <w:tcPr>
             <w:tcW w:w="6974" w:type="dxa"/>
           </w:tcPr>
-          <w:p>
-            <w:pPr>
-              <w:rPr>
-                <w:b/>
-                <w:bCs/>
-                <w:sz w:val="24"/>
-                <w:szCs w:val="24"/>
-              </w:rPr>
-            </w:pPr>
+          <w:p xmlns:w="http://schemas.openxmlformats.org/wordprocessingml/2006/main">
+            <w:pPr>
+              <w:rPr>
+                <w:rFonts w:ascii="Arial" w:hAnsi="Arial" w:cs="Arial"/>
+                <w:sz w:val="24"/>
+                <w:szCs w:val="24"/>
+              </w:rPr>
+            </w:pPr>
+            <w:r>
+              <w:rPr>
+                <w:rFonts w:ascii="Arial" w:hAnsi="Arial" w:cs="Arial"/>
+                <w:sz w:val="24"/>
+                <w:szCs w:val="24"/>
+              </w:rPr>
+              <w:t xml:space="preserve">{cover_target_nra}</w:t>
+            </w:r>
           </w:p>
         </w:tc>
       </w:tr>
@@ -2681,15 +2836,22 @@
           <w:tcPr>
             <w:tcW w:w="6974" w:type="dxa"/>
           </w:tcPr>
-          <w:p>
-            <w:pPr>
-              <w:rPr>
-                <w:b/>
-                <w:bCs/>
-                <w:sz w:val="24"/>
-                <w:szCs w:val="24"/>
-              </w:rPr>
-            </w:pPr>
+          <w:p xmlns:w="http://schemas.openxmlformats.org/wordprocessingml/2006/main">
+            <w:pPr>
+              <w:rPr>
+                <w:rFonts w:ascii="Arial" w:hAnsi="Arial" w:cs="Arial"/>
+                <w:sz w:val="24"/>
+                <w:szCs w:val="24"/>
+              </w:rPr>
+            </w:pPr>
+            <w:r>
+              <w:rPr>
+                <w:rFonts w:ascii="Arial" w:hAnsi="Arial" w:cs="Arial"/>
+                <w:sz w:val="24"/>
+                <w:szCs w:val="24"/>
+              </w:rPr>
+              <w:t xml:space="preserve">{employment_occupation}</w:t>
+            </w:r>
           </w:p>
         </w:tc>
       </w:tr>
@@ -2726,15 +2888,22 @@
           <w:tcPr>
             <w:tcW w:w="6974" w:type="dxa"/>
           </w:tcPr>
-          <w:p>
-            <w:pPr>
-              <w:rPr>
-                <w:b/>
-                <w:bCs/>
-                <w:sz w:val="24"/>
-                <w:szCs w:val="24"/>
-              </w:rPr>
-            </w:pPr>
+          <w:p xmlns:w="http://schemas.openxmlformats.org/wordprocessingml/2006/main">
+            <w:pPr>
+              <w:rPr>
+                <w:rFonts w:ascii="Arial" w:hAnsi="Arial" w:cs="Arial"/>
+                <w:sz w:val="24"/>
+                <w:szCs w:val="24"/>
+              </w:rPr>
+            </w:pPr>
+            <w:r>
+              <w:rPr>
+                <w:rFonts w:ascii="Arial" w:hAnsi="Arial" w:cs="Arial"/>
+                <w:sz w:val="24"/>
+                <w:szCs w:val="24"/>
+              </w:rPr>
+              <w:t xml:space="preserve">{employment_type}</w:t>
+            </w:r>
           </w:p>
         </w:tc>
       </w:tr>
@@ -2771,15 +2940,22 @@
           <w:tcPr>
             <w:tcW w:w="6974" w:type="dxa"/>
           </w:tcPr>
-          <w:p>
-            <w:pPr>
-              <w:rPr>
-                <w:b/>
-                <w:bCs/>
-                <w:sz w:val="24"/>
-                <w:szCs w:val="24"/>
-              </w:rPr>
-            </w:pPr>
+          <w:p xmlns:w="http://schemas.openxmlformats.org/wordprocessingml/2006/main">
+            <w:pPr>
+              <w:rPr>
+                <w:rFonts w:ascii="Arial" w:hAnsi="Arial" w:cs="Arial"/>
+                <w:sz w:val="24"/>
+                <w:szCs w:val="24"/>
+              </w:rPr>
+            </w:pPr>
+            <w:r>
+              <w:rPr>
+                <w:rFonts w:ascii="Arial" w:hAnsi="Arial" w:cs="Arial"/>
+                <w:sz w:val="24"/>
+                <w:szCs w:val="24"/>
+              </w:rPr>
+              <w:t xml:space="preserve">{employment_other_job}</w:t>
+            </w:r>
           </w:p>
         </w:tc>
       </w:tr>
@@ -2935,15 +3111,22 @@
             <w:tcW w:w="6974" w:type="dxa"/>
             <w:shd w:val="clear" w:color="auto" w:fill="FFFFFF" w:themeFill="background1"/>
           </w:tcPr>
-          <w:p>
-            <w:pPr>
-              <w:rPr>
-                <w:b/>
-                <w:bCs/>
-                <w:sz w:val="24"/>
-                <w:szCs w:val="24"/>
-              </w:rPr>
-            </w:pPr>
+          <w:p xmlns:w="http://schemas.openxmlformats.org/wordprocessingml/2006/main">
+            <w:pPr>
+              <w:rPr>
+                <w:rFonts w:ascii="Arial" w:hAnsi="Arial" w:cs="Arial"/>
+                <w:sz w:val="24"/>
+                <w:szCs w:val="24"/>
+              </w:rPr>
+            </w:pPr>
+            <w:r>
+              <w:rPr>
+                <w:rFonts w:ascii="Arial" w:hAnsi="Arial" w:cs="Arial"/>
+                <w:sz w:val="24"/>
+                <w:szCs w:val="24"/>
+              </w:rPr>
+              <w:t xml:space="preserve">{notes}</w:t>
+            </w:r>
           </w:p>
         </w:tc>
         <w:tc>

</xml_diff>